<commit_message>
Explain scheduler tradeoffs and proposed hybrid
</commit_message>
<xml_diff>
--- a/output/OS_Review2_Expanded_Report.docx
+++ b/output/OS_Review2_Expanded_Report.docx
@@ -4997,6 +4997,67 @@
     </w:p>
     <w:p>
       <w:pPr>
+        <w:pStyle w:val="Heading2"/>
+        <w:keepNext/>
+        <w:spacing w:before="180" w:after="60"/>
+      </w:pPr>
+      <w:r>
+        <w:rPr>
+          <w:rFonts w:ascii="Times New Roman" w:hAnsi="Times New Roman"/>
+          <w:b/>
+          <w:color w:val="000000"/>
+          <w:sz w:val="24"/>
+        </w:rPr>
+        <w:t>7.3 Why combine the two paths</w:t>
+      </w:r>
+    </w:p>
+    <w:p>
+      <w:pPr>
+        <w:keepLines/>
+        <w:spacing w:after="120"/>
+        <w:jc w:val="both"/>
+      </w:pPr>
+      <w:r>
+        <w:rPr>
+          <w:rFonts w:ascii="Times New Roman" w:hAnsi="Times New Roman"/>
+          <w:color w:val="000000"/>
+          <w:sz w:val="22"/>
+        </w:rPr>
+        <w:t>The decision tree uses measured pilot behavior rather than relying on task metadata. It beats fixed 4 on prime scan (paired ratio 0.894), but loses on the other five patterns, most on high variance (1.245). Prediction is quick; the current scheduler waits for each round to finish before deciding again. Those barriers may idle workers, though their exact contribution to the loss is unmeasured.</w:t>
+      </w:r>
+    </w:p>
+    <w:p>
+      <w:pPr>
+        <w:keepLines/>
+        <w:spacing w:after="120"/>
+        <w:jc w:val="both"/>
+      </w:pPr>
+      <w:r>
+        <w:rPr>
+          <w:rFonts w:ascii="Times New Roman" w:hAnsi="Times New Roman"/>
+          <w:color w:val="000000"/>
+          <w:sz w:val="22"/>
+        </w:rPr>
+        <w:t>Cost balancing makes one dispatch plan and starts estimated expensive batches early. It wins most on the constructed late-heavy pattern (0.870) and is below 1 on four other patterns. It is slightly slower on high variance (1.006). It cannot correct bad cost estimates from live measurements; wrongly ranked tasks could erase its benefit. That failure mode still needs testing.</w:t>
+      </w:r>
+    </w:p>
+    <w:p>
+      <w:pPr>
+        <w:keepLines/>
+        <w:spacing w:after="120"/>
+        <w:jc w:val="both"/>
+      </w:pPr>
+      <w:r>
+        <w:rPr>
+          <w:rFonts w:ascii="Times New Roman" w:hAnsi="Times New Roman"/>
+          <w:color w:val="000000"/>
+          <w:sz w:val="22"/>
+        </w:rPr>
+        <w:t>The proposed hybrid would use one pilot and one tree prediction to choose a batch-size target, then cost-balance and order only unstarted tasks without repeated round waits. A gate would reject cost estimates that disagree with pilot service times; little remaining work would fall back to fixed dispatch. This aims to retain adaptive sizing and early heavy-task execution while limiting barrier and estimation costs. It may not succeed: no hybrid wall time has been measured.</w:t>
+      </w:r>
+    </w:p>
+    <w:p>
+      <w:pPr>
         <w:pStyle w:val="Heading1"/>
         <w:ind w:hanging="282" w:start="267" w:end="0"/>
         <w:rPr/>
@@ -5880,7 +5941,7 @@
           <w:color w:val="000000"/>
           <w:sz w:val="22"/>
         </w:rPr>
-        <w:t>The proposed next stage is to retain one short pilot, use its measured features to judge whether a tree decision is worth its cost, and apply cost balancing only to tasks that have not started when metadata appear informative. The design should avoid waiting for a complete round merely to make every later choice. This is an overhead-gated proposal, not an implementation claim; its actual policy and thresholds must be fixed before the next experiment. If metadata are unreliable or the remaining task set is small, fixed dispatch may be the safer fallback.</w:t>
+        <w:t>The next implementation would run a short pilot, compute the existing five tree features, and make one tree prediction for the remaining work. It would translate the predicted chunk into a target batch cost, group unstarted tasks by estimated cost, and submit the heaviest batches first without another full-round wait. Before using that plan, it would compare pilot task-cost estimates with measured service times and check whether enough work remains to repay planning overhead. If either check fails, it would dispatch the remaining tasks with fixed chunk 4. The agreement and overhead thresholds must be set on development runs, not adjusted after seeing the final test results.</w:t>
       </w:r>
     </w:p>
     <w:p>

</xml_diff>